<commit_message>
Build site at 2021-04-23 12:22:55 UTC
</commit_message>
<xml_diff>
--- a/_Drive/Formularios/Doutorado/Modelo de inscrição.docx
+++ b/_Drive/Formularios/Doutorado/Modelo de inscrição.docx
@@ -1672,8 +1672,11 @@
           <w:szCs w:val="20"/>
         </w:rPr>
       </w:pPr>
-      <w:bookmarkStart w:colFirst="0" w:colLast="0" w:name="_6zcbrtka4g2s" w:id="10"/>
+      <w:bookmarkStart w:colFirst="0" w:colLast="0" w:name="_qx7xie3ldikv" w:id="10"/>
       <w:bookmarkEnd w:id="10"/>
+      <w:r>
+        <w:br w:type="page"/>
+      </w:r>
       <w:r>
         <w:rPr>
           <w:rtl w:val="0"/>
@@ -1689,7 +1692,7 @@
           <w:szCs w:val="20"/>
         </w:rPr>
       </w:pPr>
-      <w:bookmarkStart w:colFirst="0" w:colLast="0" w:name="_qx7xie3ldikv" w:id="11"/>
+      <w:bookmarkStart w:colFirst="0" w:colLast="0" w:name="_ggyxezisqq8z" w:id="11"/>
       <w:bookmarkEnd w:id="11"/>
       <w:r>
         <w:rPr>
@@ -2543,8 +2546,8 @@
           <w:szCs w:val="20"/>
         </w:rPr>
       </w:pPr>
-      <w:bookmarkStart w:colFirst="0" w:colLast="0" w:name="_qx7xie3ldikv" w:id="11"/>
-      <w:bookmarkEnd w:id="11"/>
+      <w:bookmarkStart w:colFirst="0" w:colLast="0" w:name="_qx7xie3ldikv" w:id="10"/>
+      <w:bookmarkEnd w:id="10"/>
       <w:r>
         <w:rPr>
           <w:rFonts w:ascii="Times" w:cs="Times" w:eastAsia="Times" w:hAnsi="Times"/>
@@ -3317,8 +3320,8 @@
           <w:szCs w:val="20"/>
         </w:rPr>
       </w:pPr>
-      <w:bookmarkStart w:colFirst="0" w:colLast="0" w:name="_qx7xie3ldikv" w:id="11"/>
-      <w:bookmarkEnd w:id="11"/>
+      <w:bookmarkStart w:colFirst="0" w:colLast="0" w:name="_qx7xie3ldikv" w:id="10"/>
+      <w:bookmarkEnd w:id="10"/>
       <w:r>
         <w:rPr>
           <w:rFonts w:ascii="Times" w:cs="Times" w:eastAsia="Times" w:hAnsi="Times"/>
@@ -4091,7 +4094,7 @@
           <w:szCs w:val="20"/>
         </w:rPr>
       </w:pPr>
-      <w:bookmarkStart w:colFirst="0" w:colLast="0" w:name="_9k8jvmnu33ki" w:id="13"/>
+      <w:bookmarkStart w:colFirst="0" w:colLast="0" w:name="_whd3eq3uch4" w:id="13"/>
       <w:bookmarkEnd w:id="13"/>
       <w:r>
         <w:rPr>
@@ -4850,6 +4853,9 @@
       </w:pPr>
       <w:bookmarkStart w:colFirst="0" w:colLast="0" w:name="_c042j3y78fv6" w:id="12"/>
       <w:bookmarkEnd w:id="12"/>
+      <w:r>
+        <w:br w:type="page"/>
+      </w:r>
       <w:r>
         <w:rPr>
           <w:rtl w:val="0"/>
@@ -5147,8 +5153,8 @@
           <w:szCs w:val="20"/>
         </w:rPr>
       </w:pPr>
-      <w:bookmarkStart w:colFirst="0" w:colLast="0" w:name="_qx7xie3ldikv" w:id="11"/>
-      <w:bookmarkEnd w:id="11"/>
+      <w:bookmarkStart w:colFirst="0" w:colLast="0" w:name="_qx7xie3ldikv" w:id="10"/>
+      <w:bookmarkEnd w:id="10"/>
       <w:r>
         <w:rPr>
           <w:rFonts w:ascii="Times" w:cs="Times" w:eastAsia="Times" w:hAnsi="Times"/>
@@ -5277,7 +5283,7 @@
           <w:szCs w:val="20"/>
         </w:rPr>
       </w:pPr>
-      <w:bookmarkStart w:colFirst="0" w:colLast="0" w:name="_sk0afj3ajax0" w:id="16"/>
+      <w:bookmarkStart w:colFirst="0" w:colLast="0" w:name="_k5uifyo63zfu" w:id="16"/>
       <w:bookmarkEnd w:id="16"/>
       <w:r>
         <w:rPr>
@@ -5294,7 +5300,7 @@
           <w:szCs w:val="20"/>
         </w:rPr>
       </w:pPr>
-      <w:bookmarkStart w:colFirst="0" w:colLast="0" w:name="_k5uifyo63zfu" w:id="17"/>
+      <w:bookmarkStart w:colFirst="0" w:colLast="0" w:name="_d7ftgjcevcj" w:id="17"/>
       <w:bookmarkEnd w:id="17"/>
       <w:r>
         <w:rPr>
@@ -5311,7 +5317,7 @@
           <w:szCs w:val="20"/>
         </w:rPr>
       </w:pPr>
-      <w:bookmarkStart w:colFirst="0" w:colLast="0" w:name="_d7ftgjcevcj" w:id="18"/>
+      <w:bookmarkStart w:colFirst="0" w:colLast="0" w:name="_vvkz7afkflx1" w:id="18"/>
       <w:bookmarkEnd w:id="18"/>
       <w:r>
         <w:rPr>
@@ -5410,14 +5416,14 @@
     <w:p>
       <w:pPr>
         <w:ind w:left="0" w:firstLine="0"/>
-        <w:jc w:val="right"/>
+        <w:jc w:val="left"/>
         <w:rPr>
           <w:rFonts w:ascii="Times" w:cs="Times" w:eastAsia="Times" w:hAnsi="Times"/>
           <w:sz w:val="20"/>
           <w:szCs w:val="20"/>
         </w:rPr>
       </w:pPr>
-      <w:bookmarkStart w:colFirst="0" w:colLast="0" w:name="_99dm428fljsl" w:id="23"/>
+      <w:bookmarkStart w:colFirst="0" w:colLast="0" w:name="_7g3n71klofui" w:id="23"/>
       <w:bookmarkEnd w:id="23"/>
       <w:r>
         <w:rPr>
@@ -5428,14 +5434,14 @@
     <w:p>
       <w:pPr>
         <w:ind w:left="0" w:firstLine="0"/>
-        <w:jc w:val="right"/>
+        <w:jc w:val="left"/>
         <w:rPr>
           <w:rFonts w:ascii="Times" w:cs="Times" w:eastAsia="Times" w:hAnsi="Times"/>
           <w:sz w:val="20"/>
           <w:szCs w:val="20"/>
         </w:rPr>
       </w:pPr>
-      <w:bookmarkStart w:colFirst="0" w:colLast="0" w:name="_7g3n71klofui" w:id="24"/>
+      <w:bookmarkStart w:colFirst="0" w:colLast="0" w:name="_fk1r12cd4u0g" w:id="24"/>
       <w:bookmarkEnd w:id="24"/>
       <w:r>
         <w:rPr>
@@ -5487,7 +5493,11 @@
       <w:pPr>
         <w:ind w:left="0" w:firstLine="0"/>
         <w:jc w:val="right"/>
-        <w:rPr/>
+        <w:rPr>
+          <w:rFonts w:ascii="Times" w:cs="Times" w:eastAsia="Times" w:hAnsi="Times"/>
+          <w:sz w:val="20"/>
+          <w:szCs w:val="20"/>
+        </w:rPr>
       </w:pPr>
       <w:bookmarkStart w:colFirst="0" w:colLast="0" w:name="_sqlmrgj2m06e" w:id="27"/>
       <w:bookmarkEnd w:id="27"/>
@@ -5499,6 +5509,9 @@
           <w:rtl w:val="0"/>
         </w:rPr>
         <w:t xml:space="preserve">{{Nome completo}}</w:t>
+      </w:r>
+      <w:r>
+        <w:br w:type="page"/>
       </w:r>
       <w:r>
         <w:rPr>
@@ -5509,26 +5522,15 @@
     <w:p>
       <w:pPr>
         <w:ind w:left="0" w:firstLine="0"/>
-        <w:rPr/>
+        <w:jc w:val="right"/>
+        <w:rPr>
+          <w:rFonts w:ascii="Times" w:cs="Times" w:eastAsia="Times" w:hAnsi="Times"/>
+          <w:sz w:val="20"/>
+          <w:szCs w:val="20"/>
+        </w:rPr>
       </w:pPr>
-      <w:bookmarkStart w:colFirst="0" w:colLast="0" w:name="_z44mthdos07f" w:id="28"/>
+      <w:bookmarkStart w:colFirst="0" w:colLast="0" w:name="_7k5acimmwadp" w:id="28"/>
       <w:bookmarkEnd w:id="28"/>
-      <w:r>
-        <w:br w:type="page"/>
-      </w:r>
-      <w:r>
-        <w:rPr>
-          <w:rtl w:val="0"/>
-        </w:rPr>
-      </w:r>
-    </w:p>
-    <w:p>
-      <w:pPr>
-        <w:ind w:left="0" w:firstLine="0"/>
-        <w:rPr/>
-      </w:pPr>
-      <w:bookmarkStart w:colFirst="0" w:colLast="0" w:name="_uxts8237klm0" w:id="29"/>
-      <w:bookmarkEnd w:id="29"/>
       <w:r>
         <w:rPr>
           <w:rtl w:val="0"/>
@@ -5972,8 +5974,8 @@
         <w:ind w:left="0" w:firstLine="0"/>
         <w:rPr/>
       </w:pPr>
-      <w:bookmarkStart w:colFirst="0" w:colLast="0" w:name="_tate9ngx9xl6" w:id="30"/>
-      <w:bookmarkEnd w:id="30"/>
+      <w:bookmarkStart w:colFirst="0" w:colLast="0" w:name="_tate9ngx9xl6" w:id="29"/>
+      <w:bookmarkEnd w:id="29"/>
       <w:r>
         <w:rPr>
           <w:rtl w:val="0"/>
@@ -6337,12 +6339,12 @@
           <wp:extent cx="863842" cy="994728"/>
           <wp:effectExtent b="0" l="0" r="0" t="0"/>
           <wp:wrapSquare wrapText="bothSides" distB="114300" distT="114300" distL="114300" distR="114300"/>
-          <wp:docPr id="2" name="image1.png"/>
+          <wp:docPr id="2" name="image2.png"/>
           <a:graphic>
             <a:graphicData uri="http://schemas.openxmlformats.org/drawingml/2006/picture">
               <pic:pic>
                 <pic:nvPicPr>
-                  <pic:cNvPr id="0" name="image1.png"/>
+                  <pic:cNvPr id="0" name="image2.png"/>
                   <pic:cNvPicPr preferRelativeResize="0"/>
                 </pic:nvPicPr>
                 <pic:blipFill>
@@ -6379,12 +6381,12 @@
           <wp:extent cx="1551940" cy="1163955"/>
           <wp:effectExtent b="0" l="0" r="0" t="0"/>
           <wp:wrapSquare wrapText="bothSides" distB="4445" distT="0" distL="114300" distR="114300"/>
-          <wp:docPr id="1" name="image2.jpg"/>
+          <wp:docPr id="1" name="image1.jpg"/>
           <a:graphic>
             <a:graphicData uri="http://schemas.openxmlformats.org/drawingml/2006/picture">
               <pic:pic>
                 <pic:nvPicPr>
-                  <pic:cNvPr id="0" name="image2.jpg"/>
+                  <pic:cNvPr id="0" name="image1.jpg"/>
                   <pic:cNvPicPr preferRelativeResize="0"/>
                 </pic:nvPicPr>
                 <pic:blipFill>
@@ -6419,8 +6421,8 @@
         <w:szCs w:val="20"/>
       </w:rPr>
     </w:pPr>
-    <w:bookmarkStart w:colFirst="0" w:colLast="0" w:name="_30j0zll" w:id="31"/>
-    <w:bookmarkEnd w:id="31"/>
+    <w:bookmarkStart w:colFirst="0" w:colLast="0" w:name="_30j0zll" w:id="30"/>
+    <w:bookmarkEnd w:id="30"/>
     <w:r>
       <w:rPr>
         <w:rtl w:val="0"/>
@@ -6449,8 +6451,8 @@
         <w:szCs w:val="36"/>
       </w:rPr>
     </w:pPr>
-    <w:bookmarkStart w:colFirst="0" w:colLast="0" w:name="_1fob9te" w:id="32"/>
-    <w:bookmarkEnd w:id="32"/>
+    <w:bookmarkStart w:colFirst="0" w:colLast="0" w:name="_1fob9te" w:id="31"/>
+    <w:bookmarkEnd w:id="31"/>
     <w:r>
       <w:rPr>
         <w:b w:val="1"/>
@@ -6483,8 +6485,8 @@
         <w:szCs w:val="32"/>
       </w:rPr>
     </w:pPr>
-    <w:bookmarkStart w:colFirst="0" w:colLast="0" w:name="_78sieahjud0r" w:id="33"/>
-    <w:bookmarkEnd w:id="33"/>
+    <w:bookmarkStart w:colFirst="0" w:colLast="0" w:name="_78sieahjud0r" w:id="32"/>
+    <w:bookmarkEnd w:id="32"/>
     <w:r>
       <w:rPr>
         <w:b w:val="1"/>
@@ -6517,8 +6519,8 @@
         <w:szCs w:val="28"/>
       </w:rPr>
     </w:pPr>
-    <w:bookmarkStart w:colFirst="0" w:colLast="0" w:name="_to8akbhyhvj1" w:id="34"/>
-    <w:bookmarkEnd w:id="34"/>
+    <w:bookmarkStart w:colFirst="0" w:colLast="0" w:name="_to8akbhyhvj1" w:id="33"/>
+    <w:bookmarkEnd w:id="33"/>
     <w:r>
       <w:rPr>
         <w:b w:val="1"/>

</xml_diff>